<commit_message>
docs: update phase 2 design docs, consolidate notes into standalone page
Refresh phase 2 milestone-escrow/product/reputation design docs and build
artifacts, drop the old SHARED_CONTRACTS doc and separate notes files
(architecture, plans, flow) in favor of a single standalone notes page.
</commit_message>
<xml_diff>
--- a/docs/phase_2/AgriContract_SDS_Full_v2.docx
+++ b/docs/phase_2/AgriContract_SDS_Full_v2.docx
@@ -8787,7 +8787,7 @@
           <w:sz w:val="21"/>
           <w:szCs w:val="21"/>
         </w:rPr>
-        <w:t xml:space="preserve">milestoneSchedule (List&lt;MilestoneTerm&gt;), toleranceRate (ngưỡng lệch cân Delta 2, mặc định chia 50/50), shortfallPenaltyThreshold (mặc định 5%), buyerPenaltyRate / sellerPenaltyRate, forceMajeureReportWindowDays (mặc định 3 ngày), buyerDepositRate (mặc định 5% totalAmount). Không còn sellerDepositRate — đã bỏ hẳn.</w:t>
+        <w:t xml:space="preserve">milestoneSchedule (List&lt;MilestoneTerm&gt;), toleranceRate (ngưỡng lệch cân Delta 2, mặc định chia 50/50), shortfallPenaltyThreshold (mặc định 5%), buyerPenaltyRate / sellerPenaltyRate, forceMajeureReportWindowDays (mặc định 3 ngày), buyerDepositRate (mặc định 5% totalAmount). sellerDepositRate (mới, 06/07/2026) — optional, mặc định 0, đàm phán per-contract giữa buyer/seller lúc NEGOTIATING, thay quyết định "bỏ hẳn" trước đây.</w:t>
       </w:r>
     </w:p>
     <w:p>
@@ -11411,7 +11411,7 @@
           <w:sz w:val="21"/>
           <w:szCs w:val="21"/>
         </w:rPr>
-        <w:t xml:space="preserve">Khi DisputeRoutingService route milestone CONTESTED sang LEVEL_2, platform commission tổ chức Level 2 (InitiateLevel2Inspection) và chờ report thật trong tối đa level2BufferWindowDays. Hết window mà report chưa CONFIRMED: platform commission thêm 1 giám định Level 1.5 làm phán quyết tạm thời, settle ngay (1 − level2SafetyBufferRate) của batchAmount cho seller theo số 1.5, giữ khoá phần còn lại trong escrow (không ghi debt — seller không có tài sản đối ứng để đòi). Khi report Level 2 thật về sau đó, chênh lệch (nếu có) trừ/bù thẳng từ buffer đang khoá.</w:t>
+        <w:t xml:space="preserve">Khi DisputeRoutingService route milestone CONTESTED sang LEVEL_2, platform commission tổ chức Level 2 (InitiateLevel2Inspection) và chờ report thật trong tối đa level2BufferWindowDays. Hết window mà report chưa CONFIRMED: platform commission thêm 1 giám định Level 1.5 làm phán quyết tạm thời, settle ngay (1 − level2SafetyBufferRate) của batchAmount cho seller theo số 1.5, giữ khoá phần còn lại trong escrow (không ghi debt — seller không có tài sản đối ứng để đòi). Khi report Level 2 thật về sau đó, chênh lệch (nếu có) trừ/bù thẳng từ buffer đang khoá. Hết thêm level2BufferTerminalDays (placeholder 30 ngày, tính từ lúc level2BufferWindowDays hết) mà vẫn chưa có report CONFIRMED: phán quyết Level 1.5 tự động thành chung thẩm, release nốt buffer cho seller, đóng milestone.</w:t>
       </w:r>
     </w:p>
     <w:p>
@@ -11434,7 +11434,7 @@
           <w:sz w:val="21"/>
           <w:szCs w:val="21"/>
         </w:rPr>
-        <w:t xml:space="preserve">Chưa đóng — 2 điểm còn treo (06/07/2026): </w:t>
+        <w:t xml:space="preserve">Chưa đóng — còn treo (06/07/2026): </w:t>
       </w:r>
       <w:r>
         <w:rPr>
@@ -11447,7 +11447,7 @@
           <w:sz w:val="21"/>
           <w:szCs w:val="21"/>
         </w:rPr>
-        <w:t xml:space="preserve">(1) level2BufferWindowDays (placeholder 7-14 ngày làm việc) và level2SafetyBufferRate (placeholder 10-15%) chưa validate với đơn vị Level 2 thật; (2) chưa quyết định buffer xử lý ra sao nếu report Level 2 không bao giờ về. Chi tiết đầy đủ ở milestone-escrow-phase2-design.md §3.2.</w:t>
+        <w:t xml:space="preserve">cả 3 số (level2BufferWindowDays 7-14 ngày, level2SafetyBufferRate 10-15%, level2BufferTerminalDays 30 ngày) là placeholder, chưa validate với đơn vị Level 2 thật. Chi tiết đầy đủ ở milestone-escrow-phase2-design.md §3.2.</w:t>
       </w:r>
     </w:p>
     <w:p>
@@ -14718,7 +14718,7 @@
                 <w:sz w:val="18"/>
                 <w:szCs w:val="18"/>
               </w:rPr>
-              <w:t xml:space="preserve">cancel() → Contract CANCELLED → publish contract.cancelled(initiatedBy). Mỗi milestone còn lại publish milestone.cancelled_with_penalty riêng. Seller huỷ: ghi penalty debt (sellerPenaltyRate × giá trị còn lại) vào audit, refund buyerDepositRate về buyer, khoá tài khoản seller. Buyer huỷ: seize buyerDepositRate (→ seller) + seize batchAmount đang khoá theo buyerPenaltyRate, khoá tài khoản buyer</w:t>
+              <w:t xml:space="preserve">cancel() → Contract CANCELLED → publish contract.cancelled(initiatedBy). Mỗi milestone còn lại publish milestone.cancelled_with_penalty riêng. Seller huỷ: nếu có sellerDepositRate đã khoá → seize ngay, offset vào penalty debt (sellerPenaltyRate × giá trị còn lại − deposit đã seize); refund buyerDepositRate về buyer, khoá tài khoản seller. Buyer huỷ: seize buyerDepositRate (→ seller) + seize batchAmount đang khoá theo buyerPenaltyRate, refund sellerDepositRate về seller nếu có (seller không phải bên phá kèo), khoá tài khoản buyer</w:t>
             </w:r>
           </w:p>
         </w:tc>
@@ -17667,7 +17667,7 @@
                 <w:sz w:val="18"/>
                 <w:szCs w:val="18"/>
               </w:rPr>
-              <w:t xml:space="preserve">Trạng thái cọc cấp hợp đồng (buyerDepositRate): DEPOSIT_LOCKED / DEPOSIT_RELEASED / DEPOSIT_SEIZED</w:t>
+              <w:t xml:space="preserve">Trạng thái cọc cấp hợp đồng — 2 field độc lập: buyerDepositState (DEPOSIT_LOCKED/RELEASED/SEIZED) và sellerDepositState (mới, 06/07/2026, cùng 3 giá trị — chỉ có ý nghĩa khi sellerDepositRate &gt; 0)</w:t>
             </w:r>
           </w:p>
         </w:tc>
@@ -18050,7 +18050,7 @@
                 <w:sz w:val="18"/>
                 <w:szCs w:val="18"/>
               </w:rPr>
-              <w:t xml:space="preserve">Gửi bank.lock_requested(entryType=LOCK_DEPOSIT, milestoneId=NULL, amount=buyerDepositRate×totalAmount, sourceEventId) → đợi bank.lock_completed → set DEPOSIT_LOCKED → báo contract-service để chuyển ACTIVE</w:t>
+              <w:t xml:space="preserve">Gửi bank.lock_requested(entryType=LOCK_DEPOSIT, milestoneId=NULL, amount=buyerDepositRate×totalAmount, sourceEventId) → đợi bank.lock_completed → set buyerDepositState=DEPOSIT_LOCKED. Nếu sellerDepositRate&gt;0 (mới, 06/07/2026): gửi thêm 1 bank.lock_requested riêng (userId=sellerId, sourceEventId khác) → set sellerDepositState=DEPOSIT_LOCKED. Cả hai xong → báo contract-service để chuyển ACTIVE</w:t>
             </w:r>
           </w:p>
         </w:tc>
@@ -18818,7 +18818,7 @@
                 <w:sz w:val="18"/>
                 <w:szCs w:val="18"/>
               </w:rPr>
-              <w:t xml:space="preserve">contract.settled → refund cọc về buyer (REFUND_TO_BUYER, milestoneId=NULL). contract.cancelled SELLER → refund cọc về buyer. contract.cancelled BUYER → seize cọc chuyển seller (SEIZE_PENALTY). milestone.cancelled_with_penalty → seize batchAmount đang khoá nếu có</w:t>
+              <w:t xml:space="preserve">contract.settled → refund buyerDepositRate về buyer (REFUND_TO_BUYER, milestoneId=NULL); nếu có sellerDepositRate đã khoá → release về seller (RELEASE_TO_SELLER). contract.cancelled SELLER → refund buyerDepositRate về buyer; nếu có sellerDepositRate đã khoá → seize (SEIZE_PENALTY), offset vào penalty debt (mới, 06/07/2026). contract.cancelled BUYER → seize buyerDepositRate chuyển seller (SEIZE_PENALTY); nếu có sellerDepositRate đã khoá → release về seller (seller không phải bên phá kèo, mới 06/07/2026). milestone.cancelled_with_penalty → seize batchAmount đang khoá nếu có</w:t>
             </w:r>
           </w:p>
         </w:tc>
@@ -18928,7 +18928,17 @@
           <w:szCs w:val="17"/>
         </w:rPr>
         <w:br/>
-        <w:t xml:space="preserve">  deposit_status    VARCHAR(20) NOT NULL,  -- DEPOSIT_LOCKED/RELEASED/SEIZED</w:t>
+        <w:t xml:space="preserve">  deposit_status    VARCHAR(20) NOT NULL,  -- buyerDepositRate: DEPOSIT_LOCKED/RELEASED/SEIZED</w:t>
+      </w:r>
+      <w:r>
+        <w:rPr>
+          <w:rFonts w:ascii="Consolas" w:cs="Consolas" w:eastAsia="Consolas" w:hAnsi="Consolas"/>
+          <w:color w:val="374151"/>
+          <w:sz w:val="17"/>
+          <w:szCs w:val="17"/>
+        </w:rPr>
+        <w:br/>
+        <w:t xml:space="preserve">  seller_deposit_status VARCHAR(20) NULL,  -- sellerDepositRate (mới, 06/07/2026), NULL nếu rate=0 — cùng 3 giá trị</w:t>
       </w:r>
       <w:r>
         <w:rPr>
@@ -24381,7 +24391,7 @@
                 <w:sz w:val="17"/>
                 <w:szCs w:val="17"/>
               </w:rPr>
-              <w:t xml:space="preserve">forceMajeureReportWindowDays</w:t>
+              <w:t xml:space="preserve">sellerDepositRate (mới, 06/07/2026)</w:t>
             </w:r>
           </w:p>
         </w:tc>
@@ -24451,7 +24461,7 @@
                 <w:sz w:val="17"/>
                 <w:szCs w:val="17"/>
               </w:rPr>
-              <w:t xml:space="preserve">Mặc định 3 ngày; khác theo mặt hàng</w:t>
+              <w:t xml:space="preserve">Optional, mặc định 0 — đàm phán per-contract, thay quyết định "bỏ hẳn" trước đây</w:t>
             </w:r>
           </w:p>
         </w:tc>
@@ -24489,7 +24499,7 @@
                 <w:sz w:val="17"/>
                 <w:szCs w:val="17"/>
               </w:rPr>
-              <w:t xml:space="preserve">level2BufferWindowDays (mới, 06/07/2026)</w:t>
+              <w:t xml:space="preserve">forceMajeureReportWindowDays</w:t>
             </w:r>
           </w:p>
         </w:tc>
@@ -24525,7 +24535,7 @@
                 <w:sz w:val="17"/>
                 <w:szCs w:val="17"/>
               </w:rPr>
-              <w:t xml:space="preserve">application.yml</w:t>
+              <w:t xml:space="preserve">ContractTerms</w:t>
             </w:r>
           </w:p>
         </w:tc>
@@ -24561,7 +24571,7 @@
                 <w:sz w:val="17"/>
                 <w:szCs w:val="17"/>
               </w:rPr>
-              <w:t xml:space="preserve">Placeholder 7-14 ngày làm việc — chưa validate với đơn vị Level 2 thật</w:t>
+              <w:t xml:space="preserve">Mặc định 3 ngày; khác theo mặt hàng</w:t>
             </w:r>
           </w:p>
         </w:tc>
@@ -24598,7 +24608,7 @@
                 <w:sz w:val="17"/>
                 <w:szCs w:val="17"/>
               </w:rPr>
-              <w:t xml:space="preserve">level2SafetyBufferRate (mới, 06/07/2026)</w:t>
+              <w:t xml:space="preserve">level2BufferWindowDays (mới, 06/07/2026)</w:t>
             </w:r>
           </w:p>
         </w:tc>
@@ -24668,7 +24678,224 @@
                 <w:sz w:val="17"/>
                 <w:szCs w:val="17"/>
               </w:rPr>
+              <w:t xml:space="preserve">Placeholder 7-14 ngày làm việc — chưa validate với đơn vị Level 2 thật</w:t>
+            </w:r>
+          </w:p>
+        </w:tc>
+      </w:tr>
+      <w:tr>
+        <w:tc>
+          <w:tcPr>
+            <w:tcW w:type="dxa" w:w="4200"/>
+            <w:tcBorders>
+              <w:top w:val="single" w:color="D1D5DB" w:sz="4"/>
+              <w:left w:val="single" w:color="D1D5DB" w:sz="4"/>
+              <w:bottom w:val="single" w:color="D1D5DB" w:sz="4"/>
+              <w:right w:val="single" w:color="D1D5DB" w:sz="4"/>
+            </w:tcBorders>
+            <w:shd w:fill="F9FAFB" w:color="auto" w:val="clear"/>
+            <w:tcMar>
+              <w:top w:type="dxa" w:w="60"/>
+              <w:left w:type="dxa" w:w="90"/>
+              <w:bottom w:type="dxa" w:w="60"/>
+              <w:right w:type="dxa" w:w="90"/>
+            </w:tcMar>
+            <w:vAlign w:val="center"/>
+          </w:tcPr>
+          <w:p>
+            <w:pPr>
+              <w:spacing w:after="0" w:line="252"/>
+              <w:jc w:val="left"/>
+            </w:pPr>
+            <w:r>
+              <w:rPr>
+                <w:rFonts w:ascii="Calibri" w:cs="Calibri" w:eastAsia="Calibri" w:hAnsi="Calibri"/>
+                <w:b w:val="false"/>
+                <w:bCs w:val="false"/>
+                <w:color w:val="111827"/>
+                <w:sz w:val="17"/>
+                <w:szCs w:val="17"/>
+              </w:rPr>
+              <w:t xml:space="preserve">level2SafetyBufferRate (mới, 06/07/2026)</w:t>
+            </w:r>
+          </w:p>
+        </w:tc>
+        <w:tc>
+          <w:tcPr>
+            <w:tcW w:type="dxa" w:w="2100"/>
+            <w:tcBorders>
+              <w:top w:val="single" w:color="D1D5DB" w:sz="4"/>
+              <w:left w:val="single" w:color="D1D5DB" w:sz="4"/>
+              <w:bottom w:val="single" w:color="D1D5DB" w:sz="4"/>
+              <w:right w:val="single" w:color="D1D5DB" w:sz="4"/>
+            </w:tcBorders>
+            <w:shd w:fill="F9FAFB" w:color="auto" w:val="clear"/>
+            <w:tcMar>
+              <w:top w:type="dxa" w:w="60"/>
+              <w:left w:type="dxa" w:w="90"/>
+              <w:bottom w:type="dxa" w:w="60"/>
+              <w:right w:type="dxa" w:w="90"/>
+            </w:tcMar>
+            <w:vAlign w:val="center"/>
+          </w:tcPr>
+          <w:p>
+            <w:pPr>
+              <w:spacing w:after="0" w:line="252"/>
+              <w:jc w:val="center"/>
+            </w:pPr>
+            <w:r>
+              <w:rPr>
+                <w:rFonts w:ascii="Calibri" w:cs="Calibri" w:eastAsia="Calibri" w:hAnsi="Calibri"/>
+                <w:b w:val="false"/>
+                <w:bCs w:val="false"/>
+                <w:color w:val="111827"/>
+                <w:sz w:val="17"/>
+                <w:szCs w:val="17"/>
+              </w:rPr>
+              <w:t xml:space="preserve">application.yml</w:t>
+            </w:r>
+          </w:p>
+        </w:tc>
+        <w:tc>
+          <w:tcPr>
+            <w:tcW w:type="dxa" w:w="3338"/>
+            <w:tcBorders>
+              <w:top w:val="single" w:color="D1D5DB" w:sz="4"/>
+              <w:left w:val="single" w:color="D1D5DB" w:sz="4"/>
+              <w:bottom w:val="single" w:color="D1D5DB" w:sz="4"/>
+              <w:right w:val="single" w:color="D1D5DB" w:sz="4"/>
+            </w:tcBorders>
+            <w:shd w:fill="F9FAFB" w:color="auto" w:val="clear"/>
+            <w:tcMar>
+              <w:top w:type="dxa" w:w="60"/>
+              <w:left w:type="dxa" w:w="90"/>
+              <w:bottom w:type="dxa" w:w="60"/>
+              <w:right w:type="dxa" w:w="90"/>
+            </w:tcMar>
+            <w:vAlign w:val="center"/>
+          </w:tcPr>
+          <w:p>
+            <w:pPr>
+              <w:spacing w:after="0" w:line="252"/>
+              <w:jc w:val="left"/>
+            </w:pPr>
+            <w:r>
+              <w:rPr>
+                <w:rFonts w:ascii="Calibri" w:cs="Calibri" w:eastAsia="Calibri" w:hAnsi="Calibri"/>
+                <w:b w:val="false"/>
+                <w:bCs w:val="false"/>
+                <w:color w:val="111827"/>
+                <w:sz w:val="17"/>
+                <w:szCs w:val="17"/>
+              </w:rPr>
               <w:t xml:space="preserve">Placeholder 10-15% batchAmount — chưa có dữ liệu variance thật</w:t>
+            </w:r>
+          </w:p>
+        </w:tc>
+      </w:tr>
+      <w:tr>
+        <w:tc>
+          <w:tcPr>
+            <w:tcW w:type="dxa" w:w="4200"/>
+            <w:tcBorders>
+              <w:top w:val="single" w:color="D1D5DB" w:sz="4"/>
+              <w:left w:val="single" w:color="D1D5DB" w:sz="4"/>
+              <w:bottom w:val="single" w:color="D1D5DB" w:sz="4"/>
+              <w:right w:val="single" w:color="D1D5DB" w:sz="4"/>
+            </w:tcBorders>
+            <w:tcMar>
+              <w:top w:type="dxa" w:w="60"/>
+              <w:left w:type="dxa" w:w="90"/>
+              <w:bottom w:type="dxa" w:w="60"/>
+              <w:right w:type="dxa" w:w="90"/>
+            </w:tcMar>
+            <w:vAlign w:val="center"/>
+          </w:tcPr>
+          <w:p>
+            <w:pPr>
+              <w:spacing w:after="0" w:line="252"/>
+              <w:jc w:val="left"/>
+            </w:pPr>
+            <w:r>
+              <w:rPr>
+                <w:rFonts w:ascii="Calibri" w:cs="Calibri" w:eastAsia="Calibri" w:hAnsi="Calibri"/>
+                <w:b w:val="false"/>
+                <w:bCs w:val="false"/>
+                <w:color w:val="111827"/>
+                <w:sz w:val="17"/>
+                <w:szCs w:val="17"/>
+              </w:rPr>
+              <w:t xml:space="preserve">level2BufferTerminalDays (mới, 06/07/2026)</w:t>
+            </w:r>
+          </w:p>
+        </w:tc>
+        <w:tc>
+          <w:tcPr>
+            <w:tcW w:type="dxa" w:w="2100"/>
+            <w:tcBorders>
+              <w:top w:val="single" w:color="D1D5DB" w:sz="4"/>
+              <w:left w:val="single" w:color="D1D5DB" w:sz="4"/>
+              <w:bottom w:val="single" w:color="D1D5DB" w:sz="4"/>
+              <w:right w:val="single" w:color="D1D5DB" w:sz="4"/>
+            </w:tcBorders>
+            <w:tcMar>
+              <w:top w:type="dxa" w:w="60"/>
+              <w:left w:type="dxa" w:w="90"/>
+              <w:bottom w:type="dxa" w:w="60"/>
+              <w:right w:type="dxa" w:w="90"/>
+            </w:tcMar>
+            <w:vAlign w:val="center"/>
+          </w:tcPr>
+          <w:p>
+            <w:pPr>
+              <w:spacing w:after="0" w:line="252"/>
+              <w:jc w:val="center"/>
+            </w:pPr>
+            <w:r>
+              <w:rPr>
+                <w:rFonts w:ascii="Calibri" w:cs="Calibri" w:eastAsia="Calibri" w:hAnsi="Calibri"/>
+                <w:b w:val="false"/>
+                <w:bCs w:val="false"/>
+                <w:color w:val="111827"/>
+                <w:sz w:val="17"/>
+                <w:szCs w:val="17"/>
+              </w:rPr>
+              <w:t xml:space="preserve">application.yml</w:t>
+            </w:r>
+          </w:p>
+        </w:tc>
+        <w:tc>
+          <w:tcPr>
+            <w:tcW w:type="dxa" w:w="3338"/>
+            <w:tcBorders>
+              <w:top w:val="single" w:color="D1D5DB" w:sz="4"/>
+              <w:left w:val="single" w:color="D1D5DB" w:sz="4"/>
+              <w:bottom w:val="single" w:color="D1D5DB" w:sz="4"/>
+              <w:right w:val="single" w:color="D1D5DB" w:sz="4"/>
+            </w:tcBorders>
+            <w:tcMar>
+              <w:top w:type="dxa" w:w="60"/>
+              <w:left w:type="dxa" w:w="90"/>
+              <w:bottom w:type="dxa" w:w="60"/>
+              <w:right w:type="dxa" w:w="90"/>
+            </w:tcMar>
+            <w:vAlign w:val="center"/>
+          </w:tcPr>
+          <w:p>
+            <w:pPr>
+              <w:spacing w:after="0" w:line="252"/>
+              <w:jc w:val="left"/>
+            </w:pPr>
+            <w:r>
+              <w:rPr>
+                <w:rFonts w:ascii="Calibri" w:cs="Calibri" w:eastAsia="Calibri" w:hAnsi="Calibri"/>
+                <w:b w:val="false"/>
+                <w:bCs w:val="false"/>
+                <w:color w:val="111827"/>
+                <w:sz w:val="17"/>
+                <w:szCs w:val="17"/>
+              </w:rPr>
+              <w:t xml:space="preserve">Placeholder 30 ngày — hết hạn thì phán quyết Level 1.5 tự động thành chung thẩm</w:t>
             </w:r>
           </w:p>
         </w:tc>
@@ -24887,7 +25114,43 @@
           <w:sz w:val="21"/>
           <w:szCs w:val="21"/>
         </w:rPr>
-        <w:t xml:space="preserve">level2BufferWindowDays (7-14 ngày) và level2SafetyBufferRate (10-15%) là placeholder, chưa validate với đơn vị Level 2 thật (đã liên hệ NHL, chưa có phản hồi). Chưa quyết định buffer xử lý ra sao nếu report Level 2 không bao giờ về — cần session riêng trước khi coi là chốt cứng.</w:t>
+        <w:t xml:space="preserve">level2BufferWindowDays (7-14 ngày), level2SafetyBufferRate (10-15%), level2BufferTerminalDays (30 ngày) đều là placeholder, chưa validate với đơn vị Level 2 thật (đã liên hệ NHL, chưa có phản hồi). Cơ chế terminal cutoff đã đóng câu hỏi "buffer xử lý sao nếu report không bao giờ về".</w:t>
+      </w:r>
+    </w:p>
+    <w:p>
+      <w:pPr>
+        <w:pStyle w:val="ListParagraph"/>
+        <w:numPr>
+          <w:ilvl w:val="0"/>
+          <w:numId w:val="2"/>
+        </w:numPr>
+        <w:spacing w:after="60" w:line="276"/>
+      </w:pPr>
+      <w:r>
+        <w:rPr>
+          <w:rFonts w:ascii="Calibri" w:cs="Calibri" w:eastAsia="Calibri" w:hAnsi="Calibri"/>
+          <w:b/>
+          <w:bCs/>
+          <w:i w:val="false"/>
+          <w:iCs w:val="false"/>
+          <w:color w:val="111827"/>
+          <w:sz w:val="21"/>
+          <w:szCs w:val="21"/>
+        </w:rPr>
+        <w:t xml:space="preserve">sellerDepositRate optional (mới, 06/07/2026, chưa đóng hoàn toàn). </w:t>
+      </w:r>
+      <w:r>
+        <w:rPr>
+          <w:rFonts w:ascii="Calibri" w:cs="Calibri" w:eastAsia="Calibri" w:hAnsi="Calibri"/>
+          <w:b w:val="false"/>
+          <w:bCs w:val="false"/>
+          <w:i w:val="false"/>
+          <w:iCs w:val="false"/>
+          <w:color w:val="111827"/>
+          <w:sz w:val="21"/>
+          <w:szCs w:val="21"/>
+        </w:rPr>
+        <w:t xml:space="preserve">Thay quyết định "bỏ hẳn" trước đây — đàm phán per-contract. Còn treo: lockDurationDays nặng hơn riêng cho case cancel-ở-0-milestone khi sellerDepositRate=0 — Cường chưa xác nhận áp dụng hay không.</w:t>
       </w:r>
     </w:p>
     <w:p>
@@ -30017,6 +30280,38 @@
     </w:p>
     <w:p>
       <w:pPr>
+        <w:spacing w:after="120" w:before="0" w:line="276"/>
+        <w:jc w:val="both"/>
+      </w:pPr>
+      <w:r>
+        <w:rPr>
+          <w:rFonts w:ascii="Calibri" w:cs="Calibri" w:eastAsia="Calibri" w:hAnsi="Calibri"/>
+          <w:b/>
+          <w:bCs/>
+          <w:i w:val="false"/>
+          <w:iCs w:val="false"/>
+          <w:color w:val="111827"/>
+          <w:sz w:val="21"/>
+          <w:szCs w:val="21"/>
+        </w:rPr>
+        <w:t xml:space="preserve">Cập nhật (06/07/2026) — tách 2 nhóm tín hiệu: </w:t>
+      </w:r>
+      <w:r>
+        <w:rPr>
+          <w:rFonts w:ascii="Calibri" w:cs="Calibri" w:eastAsia="Calibri" w:hAnsi="Calibri"/>
+          <w:b w:val="false"/>
+          <w:bCs w:val="false"/>
+          <w:i w:val="false"/>
+          <w:iCs w:val="false"/>
+          <w:color w:val="111827"/>
+          <w:sz w:val="21"/>
+          <w:szCs w:val="21"/>
+        </w:rPr>
+        <w:t xml:space="preserve">"đột biến doanh số" (tín hiệu tương đối) cần baseline lịch sử của chính account — account mới không có gì để so, nên không sửa được bằng đổi threshold. Thêm nhóm tín hiệu TUYỆT ĐỐI song song: ngưỡng chuyển khoản 500 triệu đồng (Thông tư 27/2025/TT-NHNN) trigger CONFIRM_CLEAN hold NGAY trên chính giao dịch, kể cả giao dịch đầu tiên của account mới — đóng đúng gap "one-shot fraud" (tài khoản giả, 1 hợp đồng khủng, rút rồi bỏ) mà nhóm tương đối chỉ bắt được từ giao dịch thứ 2. Không đóng toàn bộ — one-shot fraud dưới 500 triệu vẫn còn nguyên gap cũ.</w:t>
+      </w:r>
+    </w:p>
+    <w:p>
+      <w:pPr>
         <w:pBdr>
           <w:top w:val="single" w:color="D1D5DB" w:sz="2" w:space="6"/>
           <w:bottom w:val="single" w:color="D1D5DB" w:sz="2" w:space="6"/>
@@ -30517,7 +30812,7 @@
                 <w:sz w:val="18"/>
                 <w:szCs w:val="18"/>
               </w:rPr>
-              <w:t xml:space="preserve">Tính composite fraud score theo cặp/account → publish event hold khi vượt ngưỡng</w:t>
+              <w:t xml:space="preserve">Tính composite fraud score theo cặp/account (2 nhóm tín hiệu, mới 06/07/2026) → publish event hold khi vượt ngưỡng — nhóm tương đối hold giao dịch kế tiếp, nhóm tuyệt đối hold ngay giao dịch hiện tại</w:t>
             </w:r>
           </w:p>
         </w:tc>
@@ -35373,7 +35668,7 @@
           <w:sz w:val="21"/>
           <w:szCs w:val="21"/>
         </w:rPr>
-        <w:t xml:space="preserve">AML phát hiện giao dịch KẾ TIẾP, không phải hiện tại. </w:t>
+        <w:t xml:space="preserve">AML phát hiện giao dịch KẾ TIẾP cho tín hiệu tương đối; ngưỡng tuyệt đối bắt được ngay giao dịch đầu (mới, 06/07/2026). </w:t>
       </w:r>
       <w:r>
         <w:rPr>
@@ -35386,7 +35681,7 @@
           <w:sz w:val="21"/>
           <w:szCs w:val="21"/>
         </w:rPr>
-        <w:t xml:space="preserve">Detect dựa trên pattern lặp lại cần đủ lịch sử — chính giao dịch làm score vượt ngưỡng không bị hold, chỉ giao dịch tiếp theo của cặp đó. Giới hạn cấu trúc, không sửa bằng đổi threshold.</w:t>
+        <w:t xml:space="preserve">Detect dựa trên pattern lặp lại cần đủ lịch sử — chính giao dịch làm score vượt ngưỡng không bị hold, chỉ giao dịch tiếp theo của cặp đó, giới hạn cấu trúc không sửa bằng đổi threshold. Nhóm tín hiệu tuyệt đối mới (ngưỡng luật định 500 triệu) đóng được phần này cho giao dịch đủ lớn — nhưng one-shot fraud dưới ngưỡng đó vẫn còn nguyên gap cũ.</w:t>
       </w:r>
     </w:p>
     <w:p>
@@ -37412,7 +37707,7 @@
           <w:sz w:val="22"/>
           <w:szCs w:val="22"/>
         </w:rPr>
-        <w:t xml:space="preserve">2.4.1 Geo-risk verification qua vệ tinh — Sentinel-2 NDVI (mới, 06/07/2026, chưa đóng)</w:t>
+        <w:t xml:space="preserve">2.4.1 Geo-risk verification qua vệ tinh — Sentinel-2 NDVI (mới, 06/07/2026)</w:t>
       </w:r>
     </w:p>
     <w:p>
@@ -37463,7 +37758,7 @@
           <w:sz w:val="21"/>
           <w:szCs w:val="21"/>
         </w:rPr>
-        <w:t xml:space="preserve">2 field mới, tách biệt rõ tiến trình vs kết quả: </w:t>
+        <w:t xml:space="preserve">INCONCLUSIVE — outcome thứ 3 (mới, 06/07/2026): </w:t>
       </w:r>
       <w:r>
         <w:rPr>
@@ -37476,7 +37771,71 @@
           <w:sz w:val="21"/>
           <w:szCs w:val="21"/>
         </w:rPr>
-        <w:t xml:space="preserve">geoVerificationStatus (PENDING/CHECKED/UNVERIFIED) là trạng thái check đã chạy xong chưa; geoRiskLevel (LOW_RISK/HIGH_RISK, nullable) là kết quả thật, chỉ có giá trị khi CHECKED. geoVerificationTimeoutHours (đề xuất 4-6 giờ) — tính bằng GIỜ chứ không phải ngày, vì dữ liệu đã tồn tại sẵn, timeout chỉ hứng lỗi tạm thời (mây che, rate limit). Hết timeout mà chưa có kết quả → UNVERIFIED (khác HIGH_RISK — đây là "chưa biết", không phải "có bằng chứng rủi ro"). CreateListing reject nếu registryEntryId đang PENDING (tránh race condition listing lên sàn trước khi biết risk).</w:t>
+        <w:t xml:space="preserve">mây che dày mùa mưa (Tây Nguyên/Đông Nam Bộ) và xen canh nhiều tầng (cà phê dưới tán sầu riêng, cao su tái canh) khiến NDVI đọc nhiễu, dễ kết luận sai thành phá rừng dù đất canh tác hợp pháp. Khi API trả lời nhưng tín hiệu không đủ tin cậy để phân loại nhị phân → geoRiskLevel = INCONCLUSIVE — khác HIGH_RISK (có bằng chứng rủi ro) và khác UNVERIFIED (chưa có câu trả lời gì, lỗi kỹ thuật).</w:t>
+      </w:r>
+    </w:p>
+    <w:p>
+      <w:pPr>
+        <w:spacing w:after="120" w:before="0" w:line="276"/>
+        <w:jc w:val="both"/>
+      </w:pPr>
+      <w:r>
+        <w:rPr>
+          <w:rFonts w:ascii="Calibri" w:cs="Calibri" w:eastAsia="Calibri" w:hAnsi="Calibri"/>
+          <w:b/>
+          <w:bCs/>
+          <w:i w:val="false"/>
+          <w:iCs w:val="false"/>
+          <w:color w:val="111827"/>
+          <w:sz w:val="21"/>
+          <w:szCs w:val="21"/>
+        </w:rPr>
+        <w:t xml:space="preserve">2 field mới, tách biệt rõ tiến trình vs kết quả: </w:t>
+      </w:r>
+      <w:r>
+        <w:rPr>
+          <w:rFonts w:ascii="Calibri" w:cs="Calibri" w:eastAsia="Calibri" w:hAnsi="Calibri"/>
+          <w:b w:val="false"/>
+          <w:bCs w:val="false"/>
+          <w:i w:val="false"/>
+          <w:iCs w:val="false"/>
+          <w:color w:val="111827"/>
+          <w:sz w:val="21"/>
+          <w:szCs w:val="21"/>
+        </w:rPr>
+        <w:t xml:space="preserve">geoVerificationStatus (PENDING/CHECKED/UNVERIFIED) là trạng thái check đã chạy xong chưa; geoRiskLevel (LOW_RISK/HIGH_RISK/INCONCLUSIVE, nullable) là kết quả thật, chỉ có giá trị khi CHECKED. geoVerificationTimeoutHours (đề xuất 4-6 giờ) — tính bằng GIỜ chứ không phải ngày, vì dữ liệu đã tồn tại sẵn, timeout chỉ hứng lỗi tạm thời (mây che, rate limit). Hết timeout mà chưa có kết quả → UNVERIFIED. CreateListing reject nếu registryEntryId đang PENDING (tránh race condition listing lên sàn trước khi biết risk).</w:t>
+      </w:r>
+    </w:p>
+    <w:p>
+      <w:pPr>
+        <w:spacing w:after="120" w:before="0" w:line="276"/>
+        <w:jc w:val="both"/>
+      </w:pPr>
+      <w:r>
+        <w:rPr>
+          <w:rFonts w:ascii="Calibri" w:cs="Calibri" w:eastAsia="Calibri" w:hAnsi="Calibri"/>
+          <w:b/>
+          <w:bCs/>
+          <w:i w:val="false"/>
+          <w:iCs w:val="false"/>
+          <w:color w:val="111827"/>
+          <w:sz w:val="21"/>
+          <w:szCs w:val="21"/>
+        </w:rPr>
+        <w:t xml:space="preserve">Luồng "yêu cầu đánh giá lại" bằng EXIF — đã spec đầy đủ (mới, 06/07/2026): </w:t>
+      </w:r>
+      <w:r>
+        <w:rPr>
+          <w:rFonts w:ascii="Calibri" w:cs="Calibri" w:eastAsia="Calibri" w:hAnsi="Calibri"/>
+          <w:b w:val="false"/>
+          <w:bCs w:val="false"/>
+          <w:i w:val="false"/>
+          <w:iCs w:val="false"/>
+          <w:color w:val="111827"/>
+          <w:sz w:val="21"/>
+          <w:szCs w:val="21"/>
+        </w:rPr>
+        <w:t xml:space="preserve">không bắt buộc chụp ảnh lúc đăng ký plot. Chỉ kích hoạt khi geoRiskLevel = HIGH_RISK/INCONCLUSIVE và seller muốn khiếu nại (UC-P5 dưới). Seller chụp ảnh trực tiếp qua camera app (chặn chọn ảnh có sẵn) → file-service bóc EXIF (GPS + timestamp) → point-in-polygon đối chiếu với geoJson đã đăng ký. Trong ranh giới → ghi audit "đã xác minh bằng ảnh thực địa", không xoá nhãn gốc. Ngoài ranh giới → reject, ghi audit (chống nộp ảnh vườn khác).</w:t>
       </w:r>
     </w:p>
     <w:p>
@@ -37509,7 +37868,7 @@
           <w:sz w:val="20"/>
           <w:szCs w:val="20"/>
         </w:rPr>
-        <w:t xml:space="preserve">NDVI 10m resolution + ngưỡng nhị phân là proxy thô, KHÔNG phải xác minh EUDR pháp lý đầy đủ — không được trình bày với VICOFA/buyer như "đã verify EUDR". Ngưỡng NDVI cụ thể chưa chốt, cần thực nghiệm. EXIF photo cross-check (chụp ảnh tại chỗ, đối chiếu GPS) đã thống nhất nguyên tắc nhưng field/flow chưa spec, để session riêng.</w:t>
+        <w:t xml:space="preserve">NDVI 10m resolution + ngưỡng nhị phân là proxy thô, KHÔNG phải xác minh EUDR pháp lý đầy đủ — không được trình bày với VICOFA/buyer như "đã verify EUDR". Ngưỡng NDVI cụ thể chưa chốt, cần thực nghiệm. EXIF chỉ là lớp phòng thủ bổ sung — không giải quyết được GPS spoofing.</w:t>
       </w:r>
     </w:p>
     <w:p>
@@ -38912,6 +39271,334 @@
                 <w:szCs w:val="18"/>
               </w:rPr>
               <w:t xml:space="preserve">Upload scan/PDF trích lục cho một entry đã có → file-service → cadastralExtractFileId → verificationLevel=CADASTRAL_BACKED. KHÔNG đối chiếu nội dung file với geoJson (giới hạn self-declared)</w:t>
+            </w:r>
+          </w:p>
+        </w:tc>
+      </w:tr>
+    </w:tbl>
+    <w:p>
+      <w:pPr>
+        <w:spacing w:after="40" w:before="140"/>
+      </w:pPr>
+      <w:r>
+        <w:rPr>
+          <w:rFonts w:ascii="Calibri" w:cs="Calibri" w:eastAsia="Calibri" w:hAnsi="Calibri"/>
+          <w:b/>
+          <w:bCs/>
+          <w:color w:val="1F2A37"/>
+          <w:sz w:val="21"/>
+          <w:szCs w:val="21"/>
+        </w:rPr>
+        <w:t xml:space="preserve">UC-P5 — RequestGeoReevaluation (mới, 06/07/2026)</w:t>
+      </w:r>
+    </w:p>
+    <w:tbl>
+      <w:tblPr>
+        <w:tblW w:type="dxa" w:w="9638"/>
+        <w:tblBorders>
+          <w:top w:val="single" w:color="D1D5DB" w:sz="4"/>
+          <w:left w:val="single" w:color="D1D5DB" w:sz="4"/>
+          <w:bottom w:val="single" w:color="D1D5DB" w:sz="4"/>
+          <w:right w:val="single" w:color="D1D5DB" w:sz="4"/>
+          <w:insideH w:val="single" w:color="D1D5DB" w:sz="4"/>
+          <w:insideV w:val="single" w:color="D1D5DB" w:sz="4"/>
+        </w:tblBorders>
+      </w:tblPr>
+      <w:tblGrid>
+        <w:gridCol w:w="1800"/>
+        <w:gridCol w:w="7838"/>
+      </w:tblGrid>
+      <w:tr>
+        <w:trPr>
+          <w:tblHeader/>
+        </w:trPr>
+        <w:tc>
+          <w:tcPr>
+            <w:tcW w:type="dxa" w:w="1800"/>
+            <w:tcBorders>
+              <w:top w:val="single" w:color="D1D5DB" w:sz="4"/>
+              <w:left w:val="single" w:color="D1D5DB" w:sz="4"/>
+              <w:bottom w:val="single" w:color="D1D5DB" w:sz="4"/>
+              <w:right w:val="single" w:color="D1D5DB" w:sz="4"/>
+            </w:tcBorders>
+            <w:shd w:fill="374151" w:color="auto" w:val="clear"/>
+            <w:tcMar>
+              <w:top w:type="dxa" w:w="60"/>
+              <w:left w:type="dxa" w:w="90"/>
+              <w:bottom w:type="dxa" w:w="60"/>
+              <w:right w:type="dxa" w:w="90"/>
+            </w:tcMar>
+            <w:vAlign w:val="center"/>
+          </w:tcPr>
+          <w:p>
+            <w:pPr>
+              <w:spacing w:after="0" w:line="252"/>
+              <w:jc w:val="left"/>
+            </w:pPr>
+            <w:r>
+              <w:rPr>
+                <w:rFonts w:ascii="Calibri" w:cs="Calibri" w:eastAsia="Calibri" w:hAnsi="Calibri"/>
+                <w:b/>
+                <w:bCs/>
+                <w:color w:val="FFFFFF"/>
+                <w:sz w:val="19"/>
+                <w:szCs w:val="19"/>
+              </w:rPr>
+              <w:t xml:space="preserve"/>
+            </w:r>
+          </w:p>
+        </w:tc>
+        <w:tc>
+          <w:tcPr>
+            <w:tcW w:type="dxa" w:w="7838"/>
+            <w:tcBorders>
+              <w:top w:val="single" w:color="D1D5DB" w:sz="4"/>
+              <w:left w:val="single" w:color="D1D5DB" w:sz="4"/>
+              <w:bottom w:val="single" w:color="D1D5DB" w:sz="4"/>
+              <w:right w:val="single" w:color="D1D5DB" w:sz="4"/>
+            </w:tcBorders>
+            <w:shd w:fill="374151" w:color="auto" w:val="clear"/>
+            <w:tcMar>
+              <w:top w:type="dxa" w:w="60"/>
+              <w:left w:type="dxa" w:w="90"/>
+              <w:bottom w:type="dxa" w:w="60"/>
+              <w:right w:type="dxa" w:w="90"/>
+            </w:tcMar>
+            <w:vAlign w:val="center"/>
+          </w:tcPr>
+          <w:p>
+            <w:pPr>
+              <w:spacing w:after="0" w:line="252"/>
+              <w:jc w:val="left"/>
+            </w:pPr>
+            <w:r>
+              <w:rPr>
+                <w:rFonts w:ascii="Calibri" w:cs="Calibri" w:eastAsia="Calibri" w:hAnsi="Calibri"/>
+                <w:b/>
+                <w:bCs/>
+                <w:color w:val="FFFFFF"/>
+                <w:sz w:val="19"/>
+                <w:szCs w:val="19"/>
+              </w:rPr>
+              <w:t xml:space="preserve"/>
+            </w:r>
+          </w:p>
+        </w:tc>
+      </w:tr>
+      <w:tr>
+        <w:tc>
+          <w:tcPr>
+            <w:tcW w:type="dxa" w:w="1800"/>
+            <w:tcBorders>
+              <w:top w:val="single" w:color="D1D5DB" w:sz="4"/>
+              <w:left w:val="single" w:color="D1D5DB" w:sz="4"/>
+              <w:bottom w:val="single" w:color="D1D5DB" w:sz="4"/>
+              <w:right w:val="single" w:color="D1D5DB" w:sz="4"/>
+            </w:tcBorders>
+            <w:tcMar>
+              <w:top w:type="dxa" w:w="60"/>
+              <w:left w:type="dxa" w:w="90"/>
+              <w:bottom w:type="dxa" w:w="60"/>
+              <w:right w:type="dxa" w:w="90"/>
+            </w:tcMar>
+            <w:vAlign w:val="center"/>
+          </w:tcPr>
+          <w:p>
+            <w:pPr>
+              <w:spacing w:after="0" w:line="252"/>
+              <w:jc w:val="left"/>
+            </w:pPr>
+            <w:r>
+              <w:rPr>
+                <w:rFonts w:ascii="Calibri" w:cs="Calibri" w:eastAsia="Calibri" w:hAnsi="Calibri"/>
+                <w:b/>
+                <w:bCs/>
+                <w:color w:val="111827"/>
+                <w:sz w:val="18"/>
+                <w:szCs w:val="18"/>
+              </w:rPr>
+              <w:t xml:space="preserve">Actor</w:t>
+            </w:r>
+          </w:p>
+        </w:tc>
+        <w:tc>
+          <w:tcPr>
+            <w:tcW w:type="dxa" w:w="7838"/>
+            <w:tcBorders>
+              <w:top w:val="single" w:color="D1D5DB" w:sz="4"/>
+              <w:left w:val="single" w:color="D1D5DB" w:sz="4"/>
+              <w:bottom w:val="single" w:color="D1D5DB" w:sz="4"/>
+              <w:right w:val="single" w:color="D1D5DB" w:sz="4"/>
+            </w:tcBorders>
+            <w:tcMar>
+              <w:top w:type="dxa" w:w="60"/>
+              <w:left w:type="dxa" w:w="90"/>
+              <w:bottom w:type="dxa" w:w="60"/>
+              <w:right w:type="dxa" w:w="90"/>
+            </w:tcMar>
+            <w:vAlign w:val="center"/>
+          </w:tcPr>
+          <w:p>
+            <w:pPr>
+              <w:spacing w:after="0" w:line="252"/>
+              <w:jc w:val="left"/>
+            </w:pPr>
+            <w:r>
+              <w:rPr>
+                <w:rFonts w:ascii="Calibri" w:cs="Calibri" w:eastAsia="Calibri" w:hAnsi="Calibri"/>
+                <w:b w:val="false"/>
+                <w:bCs w:val="false"/>
+                <w:color w:val="111827"/>
+                <w:sz w:val="18"/>
+                <w:szCs w:val="18"/>
+              </w:rPr>
+              <w:t xml:space="preserve">SELLER</w:t>
+            </w:r>
+          </w:p>
+        </w:tc>
+      </w:tr>
+      <w:tr>
+        <w:tc>
+          <w:tcPr>
+            <w:tcW w:type="dxa" w:w="1800"/>
+            <w:tcBorders>
+              <w:top w:val="single" w:color="D1D5DB" w:sz="4"/>
+              <w:left w:val="single" w:color="D1D5DB" w:sz="4"/>
+              <w:bottom w:val="single" w:color="D1D5DB" w:sz="4"/>
+              <w:right w:val="single" w:color="D1D5DB" w:sz="4"/>
+            </w:tcBorders>
+            <w:shd w:fill="F9FAFB" w:color="auto" w:val="clear"/>
+            <w:tcMar>
+              <w:top w:type="dxa" w:w="60"/>
+              <w:left w:type="dxa" w:w="90"/>
+              <w:bottom w:type="dxa" w:w="60"/>
+              <w:right w:type="dxa" w:w="90"/>
+            </w:tcMar>
+            <w:vAlign w:val="center"/>
+          </w:tcPr>
+          <w:p>
+            <w:pPr>
+              <w:spacing w:after="0" w:line="252"/>
+              <w:jc w:val="left"/>
+            </w:pPr>
+            <w:r>
+              <w:rPr>
+                <w:rFonts w:ascii="Calibri" w:cs="Calibri" w:eastAsia="Calibri" w:hAnsi="Calibri"/>
+                <w:b/>
+                <w:bCs/>
+                <w:color w:val="111827"/>
+                <w:sz w:val="18"/>
+                <w:szCs w:val="18"/>
+              </w:rPr>
+              <w:t xml:space="preserve">Tiền điều kiện</w:t>
+            </w:r>
+          </w:p>
+        </w:tc>
+        <w:tc>
+          <w:tcPr>
+            <w:tcW w:type="dxa" w:w="7838"/>
+            <w:tcBorders>
+              <w:top w:val="single" w:color="D1D5DB" w:sz="4"/>
+              <w:left w:val="single" w:color="D1D5DB" w:sz="4"/>
+              <w:bottom w:val="single" w:color="D1D5DB" w:sz="4"/>
+              <w:right w:val="single" w:color="D1D5DB" w:sz="4"/>
+            </w:tcBorders>
+            <w:shd w:fill="F9FAFB" w:color="auto" w:val="clear"/>
+            <w:tcMar>
+              <w:top w:type="dxa" w:w="60"/>
+              <w:left w:type="dxa" w:w="90"/>
+              <w:bottom w:type="dxa" w:w="60"/>
+              <w:right w:type="dxa" w:w="90"/>
+            </w:tcMar>
+            <w:vAlign w:val="center"/>
+          </w:tcPr>
+          <w:p>
+            <w:pPr>
+              <w:spacing w:after="0" w:line="252"/>
+              <w:jc w:val="left"/>
+            </w:pPr>
+            <w:r>
+              <w:rPr>
+                <w:rFonts w:ascii="Calibri" w:cs="Calibri" w:eastAsia="Calibri" w:hAnsi="Calibri"/>
+                <w:b w:val="false"/>
+                <w:bCs w:val="false"/>
+                <w:color w:val="111827"/>
+                <w:sz w:val="18"/>
+                <w:szCs w:val="18"/>
+              </w:rPr>
+              <w:t xml:space="preserve">geoRiskLevel = HIGH_RISK hoặc INCONCLUSIVE trên registryEntryId đó</w:t>
+            </w:r>
+          </w:p>
+        </w:tc>
+      </w:tr>
+      <w:tr>
+        <w:tc>
+          <w:tcPr>
+            <w:tcW w:type="dxa" w:w="1800"/>
+            <w:tcBorders>
+              <w:top w:val="single" w:color="D1D5DB" w:sz="4"/>
+              <w:left w:val="single" w:color="D1D5DB" w:sz="4"/>
+              <w:bottom w:val="single" w:color="D1D5DB" w:sz="4"/>
+              <w:right w:val="single" w:color="D1D5DB" w:sz="4"/>
+            </w:tcBorders>
+            <w:tcMar>
+              <w:top w:type="dxa" w:w="60"/>
+              <w:left w:type="dxa" w:w="90"/>
+              <w:bottom w:type="dxa" w:w="60"/>
+              <w:right w:type="dxa" w:w="90"/>
+            </w:tcMar>
+            <w:vAlign w:val="center"/>
+          </w:tcPr>
+          <w:p>
+            <w:pPr>
+              <w:spacing w:after="0" w:line="252"/>
+              <w:jc w:val="left"/>
+            </w:pPr>
+            <w:r>
+              <w:rPr>
+                <w:rFonts w:ascii="Calibri" w:cs="Calibri" w:eastAsia="Calibri" w:hAnsi="Calibri"/>
+                <w:b/>
+                <w:bCs/>
+                <w:color w:val="111827"/>
+                <w:sz w:val="18"/>
+                <w:szCs w:val="18"/>
+              </w:rPr>
+              <w:t xml:space="preserve">Luồng chính</w:t>
+            </w:r>
+          </w:p>
+        </w:tc>
+        <w:tc>
+          <w:tcPr>
+            <w:tcW w:type="dxa" w:w="7838"/>
+            <w:tcBorders>
+              <w:top w:val="single" w:color="D1D5DB" w:sz="4"/>
+              <w:left w:val="single" w:color="D1D5DB" w:sz="4"/>
+              <w:bottom w:val="single" w:color="D1D5DB" w:sz="4"/>
+              <w:right w:val="single" w:color="D1D5DB" w:sz="4"/>
+            </w:tcBorders>
+            <w:tcMar>
+              <w:top w:type="dxa" w:w="60"/>
+              <w:left w:type="dxa" w:w="90"/>
+              <w:bottom w:type="dxa" w:w="60"/>
+              <w:right w:type="dxa" w:w="90"/>
+            </w:tcMar>
+            <w:vAlign w:val="center"/>
+          </w:tcPr>
+          <w:p>
+            <w:pPr>
+              <w:spacing w:after="0" w:line="252"/>
+              <w:jc w:val="left"/>
+            </w:pPr>
+            <w:r>
+              <w:rPr>
+                <w:rFonts w:ascii="Calibri" w:cs="Calibri" w:eastAsia="Calibri" w:hAnsi="Calibri"/>
+                <w:b w:val="false"/>
+                <w:bCs w:val="false"/>
+                <w:color w:val="111827"/>
+                <w:sz w:val="18"/>
+                <w:szCs w:val="18"/>
+              </w:rPr>
+              <w:t xml:space="preserve">Chụp ảnh trực tiếp qua camera app (chặn chọn ảnh có sẵn) → file-service bóc EXIF (GPS+timestamp) → point-in-polygon đối chiếu geoJson. Trong ranh giới → ghi audit "đã xác minh ảnh thực địa", giữ nguyên geoRiskLevel gốc. Ngoài ranh giới → reject, ghi audit</w:t>
             </w:r>
           </w:p>
         </w:tc>
@@ -39421,7 +40108,7 @@
                 <w:sz w:val="17"/>
                 <w:szCs w:val="17"/>
               </w:rPr>
-              <w:t xml:space="preserve">GET /api/v1/plots</w:t>
+              <w:t xml:space="preserve">POST /api/v1/plots/{id}/geo-reevaluation</w:t>
             </w:r>
           </w:p>
         </w:tc>
@@ -39493,7 +40180,7 @@
                 <w:sz w:val="17"/>
                 <w:szCs w:val="17"/>
               </w:rPr>
-              <w:t xml:space="preserve">Danh sách registry của seller (chọn lúc tạo listing)</w:t>
+              <w:t xml:space="preserve">Yêu cầu đánh giá lại bằng ảnh EXIF (UC-P5)</w:t>
             </w:r>
           </w:p>
         </w:tc>
@@ -39530,7 +40217,7 @@
                 <w:sz w:val="17"/>
                 <w:szCs w:val="17"/>
               </w:rPr>
-              <w:t xml:space="preserve">POST /api/v1/listings</w:t>
+              <w:t xml:space="preserve">GET /api/v1/plots</w:t>
             </w:r>
           </w:p>
         </w:tc>
@@ -39578,6 +40265,116 @@
               <w:bottom w:val="single" w:color="D1D5DB" w:sz="4"/>
               <w:right w:val="single" w:color="D1D5DB" w:sz="4"/>
             </w:tcBorders>
+            <w:tcMar>
+              <w:top w:type="dxa" w:w="60"/>
+              <w:left w:type="dxa" w:w="90"/>
+              <w:bottom w:type="dxa" w:w="60"/>
+              <w:right w:type="dxa" w:w="90"/>
+            </w:tcMar>
+            <w:vAlign w:val="center"/>
+          </w:tcPr>
+          <w:p>
+            <w:pPr>
+              <w:spacing w:after="0" w:line="252"/>
+              <w:jc w:val="left"/>
+            </w:pPr>
+            <w:r>
+              <w:rPr>
+                <w:rFonts w:ascii="Calibri" w:cs="Calibri" w:eastAsia="Calibri" w:hAnsi="Calibri"/>
+                <w:b w:val="false"/>
+                <w:bCs w:val="false"/>
+                <w:color w:val="111827"/>
+                <w:sz w:val="17"/>
+                <w:szCs w:val="17"/>
+              </w:rPr>
+              <w:t xml:space="preserve">Danh sách registry của seller (chọn lúc tạo listing)</w:t>
+            </w:r>
+          </w:p>
+        </w:tc>
+      </w:tr>
+      <w:tr>
+        <w:tc>
+          <w:tcPr>
+            <w:tcW w:type="dxa" w:w="4400"/>
+            <w:tcBorders>
+              <w:top w:val="single" w:color="D1D5DB" w:sz="4"/>
+              <w:left w:val="single" w:color="D1D5DB" w:sz="4"/>
+              <w:bottom w:val="single" w:color="D1D5DB" w:sz="4"/>
+              <w:right w:val="single" w:color="D1D5DB" w:sz="4"/>
+            </w:tcBorders>
+            <w:shd w:fill="F9FAFB" w:color="auto" w:val="clear"/>
+            <w:tcMar>
+              <w:top w:type="dxa" w:w="60"/>
+              <w:left w:type="dxa" w:w="90"/>
+              <w:bottom w:type="dxa" w:w="60"/>
+              <w:right w:type="dxa" w:w="90"/>
+            </w:tcMar>
+            <w:vAlign w:val="center"/>
+          </w:tcPr>
+          <w:p>
+            <w:pPr>
+              <w:spacing w:after="0" w:line="252"/>
+              <w:jc w:val="left"/>
+            </w:pPr>
+            <w:r>
+              <w:rPr>
+                <w:rFonts w:ascii="Calibri" w:cs="Calibri" w:eastAsia="Calibri" w:hAnsi="Calibri"/>
+                <w:b w:val="false"/>
+                <w:bCs w:val="false"/>
+                <w:color w:val="111827"/>
+                <w:sz w:val="17"/>
+                <w:szCs w:val="17"/>
+              </w:rPr>
+              <w:t xml:space="preserve">POST /api/v1/listings</w:t>
+            </w:r>
+          </w:p>
+        </w:tc>
+        <w:tc>
+          <w:tcPr>
+            <w:tcW w:type="dxa" w:w="1400"/>
+            <w:tcBorders>
+              <w:top w:val="single" w:color="D1D5DB" w:sz="4"/>
+              <w:left w:val="single" w:color="D1D5DB" w:sz="4"/>
+              <w:bottom w:val="single" w:color="D1D5DB" w:sz="4"/>
+              <w:right w:val="single" w:color="D1D5DB" w:sz="4"/>
+            </w:tcBorders>
+            <w:shd w:fill="F9FAFB" w:color="auto" w:val="clear"/>
+            <w:tcMar>
+              <w:top w:type="dxa" w:w="60"/>
+              <w:left w:type="dxa" w:w="90"/>
+              <w:bottom w:type="dxa" w:w="60"/>
+              <w:right w:type="dxa" w:w="90"/>
+            </w:tcMar>
+            <w:vAlign w:val="center"/>
+          </w:tcPr>
+          <w:p>
+            <w:pPr>
+              <w:spacing w:after="0" w:line="252"/>
+              <w:jc w:val="center"/>
+            </w:pPr>
+            <w:r>
+              <w:rPr>
+                <w:rFonts w:ascii="Calibri" w:cs="Calibri" w:eastAsia="Calibri" w:hAnsi="Calibri"/>
+                <w:b w:val="false"/>
+                <w:bCs w:val="false"/>
+                <w:color w:val="111827"/>
+                <w:sz w:val="17"/>
+                <w:szCs w:val="17"/>
+              </w:rPr>
+              <w:t xml:space="preserve">SELLER</w:t>
+            </w:r>
+          </w:p>
+        </w:tc>
+        <w:tc>
+          <w:tcPr>
+            <w:tcW w:type="dxa" w:w="3838"/>
+            <w:tcBorders>
+              <w:top w:val="single" w:color="D1D5DB" w:sz="4"/>
+              <w:left w:val="single" w:color="D1D5DB" w:sz="4"/>
+              <w:bottom w:val="single" w:color="D1D5DB" w:sz="4"/>
+              <w:right w:val="single" w:color="D1D5DB" w:sz="4"/>
+            </w:tcBorders>
+            <w:shd w:fill="F9FAFB" w:color="auto" w:val="clear"/>
             <w:tcMar>
               <w:top w:type="dxa" w:w="60"/>
               <w:left w:type="dxa" w:w="90"/>
@@ -39795,7 +40592,7 @@
           <w:szCs w:val="17"/>
         </w:rPr>
         <w:br/>
-        <w:t xml:space="preserve">  geo_risk_level          VARCHAR(20) NULL,       -- LOW_RISK | HIGH_RISK, chỉ có giá trị khi CHECKED (§2.4.1, mới 06/07/2026)</w:t>
+        <w:t xml:space="preserve">  geo_risk_level          VARCHAR(20) NULL,       -- LOW_RISK | HIGH_RISK | INCONCLUSIVE, chỉ có giá trị khi CHECKED (§2.4.1, mới 06/07/2026)</w:t>
       </w:r>
       <w:r>
         <w:rPr>
@@ -43750,7 +44547,7 @@
           <w:sz w:val="21"/>
           <w:szCs w:val="21"/>
         </w:rPr>
-        <w:t xml:space="preserve">Geo-risk verification qua vệ tinh (mới, 06/07/2026, chưa đóng). </w:t>
+        <w:t xml:space="preserve">Geo-risk verification qua vệ tinh (mới, 06/07/2026). </w:t>
       </w:r>
       <w:r>
         <w:rPr>
@@ -43763,7 +44560,7 @@
           <w:sz w:val="21"/>
           <w:szCs w:val="21"/>
         </w:rPr>
-        <w:t xml:space="preserve">Ngưỡng NDVI phân biệt rừng/không rừng chưa chốt (cần thực nghiệm); geoVerificationTimeoutHours (4-6h) là placeholder chưa vận hành thật; EXIF photo cross-check mới thống nhất nguyên tắc, chưa spec field/flow — cần session riêng. Chi tiết đầy đủ ở product-phase2-design.md §2.2.4.</w:t>
+        <w:t xml:space="preserve">Còn treo: ngưỡng NDVI phân biệt rừng/không rừng chưa chốt (cần thực nghiệm); geoVerificationTimeoutHours (4-6h) là placeholder chưa vận hành thật. Đã đóng: luồng EXIF re-evaluation (UC-P5) — spec đầy đủ, không còn deferred. Chi tiết đầy đủ ở product-phase2-design.md §2.2.4.</w:t>
       </w:r>
     </w:p>
     <w:p>

</xml_diff>